<commit_message>
docs(auth): record display-name and session decisions in specs
Also moves the local Docker Postgres to host port 5433.

Co-Authored-By: Claude Opus 5.5 <noreply@anthropic.com>
</commit_message>
<xml_diff>
--- a/docs/auth.docx
+++ b/docs/auth.docx
@@ -706,7 +706,7 @@
     </w:p>
     <w:p>
       <w:r>
-        <w:t>// payload.email is deliberately NOT read, NOT stored, and NOT logged.</w:t>
+        <w:t>// payload.email and payload.name are deliberately NOT read, NOT stored, and NOT logged.</w:t>
       </w:r>
     </w:p>
     <w:p>
@@ -762,7 +762,7 @@
     </w:p>
     <w:p>
       <w:r>
-        <w:t>const needsOnboarding = !user.username || !user.preferredService;</w:t>
+        <w:t>const needsOnboarding = !user.displayName || !user.preferredService;</w:t>
       </w:r>
     </w:p>
     <w:p>
@@ -787,12 +787,12 @@
     </w:p>
     <w:p>
       <w:r>
-        <w:t>const { user, needsOnboarding } = await authenticateWithGoogle(req.body.token);</w:t>
+        <w:t>const { user, needsOnboarding } = await authenticateWithGoogle(req.body.credential);</w:t>
       </w:r>
     </w:p>
     <w:p>
       <w:r>
-        <w:t>const appToken = jwt.sign({ userId: user.id }, env.JWT_SECRET, { expiresIn: '7d' });</w:t>
+        <w:t>const appToken = jwt.sign({ userId: user.id }, env.JWT_SECRET, { expiresIn: '30d' });</w:t>
       </w:r>
     </w:p>
     <w:p>
@@ -888,7 +888,7 @@
           <w:color w:val="A03030"/>
           <w:sz w:val="19"/>
         </w:rPr>
-        <w:t>username</w:t>
+        <w:t>display_name</w:t>
       </w:r>
       <w:r>
         <w:t xml:space="preserve"> nor a </w:t>
@@ -936,7 +936,7 @@
         <w:t>Abandoned onboarding.</w:t>
       </w:r>
       <w:r>
-        <w:t xml:space="preserve"> A user who closes the app mid-onboarding leaves a row with no username. On their next sign-in the same </w:t>
+        <w:t xml:space="preserve"> A user who closes the app mid-onboarding leaves a row with no display name. On their next sign-in the same </w:t>
       </w:r>
       <w:r>
         <w:rPr>
@@ -969,10 +969,10 @@
         <w:rPr>
           <w:b/>
         </w:rPr>
-        <w:t>Username collision.</w:t>
+        <w:t>Display-name collision.</w:t>
       </w:r>
       <w:r>
-        <w:t xml:space="preserve"> Usernames are user-chosen and unique. Convert the Prisma </w:t>
+        <w:t xml:space="preserve"> Display names are user-chosen and unique, compared case- and whitespace-insensitively through display_name_key. Convert the Prisma </w:t>
       </w:r>
       <w:r>
         <w:rPr>
@@ -994,7 +994,7 @@
         <w:t>AppError</w:t>
       </w:r>
       <w:r>
-        <w:t xml:space="preserve"> - "That username is already taken." - per CLAUDE.md section 4.</w:t>
+        <w:t xml:space="preserve"> - "That display name is already taken." - per CLAUDE.md section 4.</w:t>
       </w:r>
     </w:p>
     <w:p>
@@ -1044,7 +1044,7 @@
         <w:t>Revoked Google access.</w:t>
       </w:r>
       <w:r>
-        <w:t xml:space="preserve"> If a user revokes the app from their Google account, future sign-ins fail verification. Existing session cookies stay valid until they expire - acceptable for a 7-day session at this scale.</w:t>
+        <w:t xml:space="preserve"> If a user revokes the app from their Google account, future sign-ins fail verification. Existing session cookies stay valid until they expire - accepted for a 30-day sliding session at this scale. Rotating JWT_SECRET is the emergency lever: it signs everyone out.</w:t>
       </w:r>
     </w:p>
     <w:p>

</xml_diff>

<commit_message>
test(profile): cover photo re-choose, profile screen and e2e, uc-3 uc-4
Unit and integration tests for POST /users/me/google-picture (privacy
check, 422/403 keep the session), the rewritten Profile component suite,
and two E2E loops. Docs: use cases, frontend screens, auth (.md + .docx),
CLAUDE.md, onboarding pointer, DEVELOPMENT.md step 2.4.

Co-Authored-By: Claude Opus 5.5 <noreply@anthropic.com>
</commit_message>
<xml_diff>
--- a/docs/auth.docx
+++ b/docs/auth.docx
@@ -1030,7 +1030,62 @@
         <w:t>profile_picture_url</w:t>
       </w:r>
       <w:r>
-        <w:t xml:space="preserve"> is nullable and the UI falls back to the generated avatar (CLAUDE.md section 8). The photo is also optional by choice: it is offered during onboarding, the generated avatar is the default, and once declined it is not stored again on later sign-ins (docs/features/onboarding.md §3).</w:t>
+        <w:t xml:space="preserve"> is nullable and the UI falls back to the generated avatar (CLAUDE.md section 8). The photo is also optional by choice: it is offered during onboarding, the generated avatar is the default, and once declined it is not stored again on later sign-ins (docs/features/onboarding.md §3). The one way back is explicit: on My Profile the user signs in with Google again, the token is verified like a sign-in, its </w:t>
+      </w:r>
+      <w:r>
+        <w:rPr>
+          <w:rFonts w:ascii="Consolas" w:hAnsi="Consolas"/>
+          <w:color w:val="A03030"/>
+          <w:sz w:val="19"/>
+        </w:rPr>
+        <w:t>sub</w:t>
+      </w:r>
+      <w:r>
+        <w:t xml:space="preserve"> must match the account, and only its </w:t>
+      </w:r>
+      <w:r>
+        <w:rPr>
+          <w:rFonts w:ascii="Consolas" w:hAnsi="Consolas"/>
+          <w:color w:val="A03030"/>
+          <w:sz w:val="19"/>
+        </w:rPr>
+        <w:t>picture</w:t>
+      </w:r>
+      <w:r>
+        <w:t xml:space="preserve"> is stored (</w:t>
+      </w:r>
+      <w:r>
+        <w:rPr>
+          <w:rFonts w:ascii="Consolas" w:hAnsi="Consolas"/>
+          <w:color w:val="A03030"/>
+          <w:sz w:val="19"/>
+        </w:rPr>
+        <w:t>POST /api/users/me/google-picture</w:t>
+      </w:r>
+      <w:r>
+        <w:t xml:space="preserve">, docs/features/profile-settings.md §4). A rejected token there is a </w:t>
+      </w:r>
+      <w:r>
+        <w:rPr>
+          <w:rFonts w:ascii="Consolas" w:hAnsi="Consolas"/>
+          <w:color w:val="A03030"/>
+          <w:sz w:val="19"/>
+        </w:rPr>
+        <w:t>422</w:t>
+      </w:r>
+      <w:r>
+        <w:t xml:space="preserve">, not a </w:t>
+      </w:r>
+      <w:r>
+        <w:rPr>
+          <w:rFonts w:ascii="Consolas" w:hAnsi="Consolas"/>
+          <w:color w:val="A03030"/>
+          <w:sz w:val="19"/>
+        </w:rPr>
+        <w:t>401</w:t>
+      </w:r>
+      <w:r>
+        <w:t xml:space="preserve">, so a valid session is not ended.</w:t>
       </w:r>
     </w:p>
     <w:p>

</xml_diff>

<commit_message>
test(admin): cover the admin lists, privacy and e2e, uc-19
Unit tests for requireAppAdmin, the admin serialisers and service;
integration tests for both endpoints (401, 403, role removed, privacy);
component tests for the Admin screen and the Profile link; one E2E loop.
Docs: frontend screens, use cases, auth (.md + .docx), CLAUDE.md,
DEVELOPMENT.md step 2.8.

Co-Authored-By: Claude Opus 5.5 <noreply@anthropic.com>
</commit_message>
<xml_diff>
--- a/docs/auth.docx
+++ b/docs/auth.docx
@@ -1165,6 +1165,33 @@
         <w:pStyle w:val="ListBullet"/>
       </w:pPr>
       <w:r>
+        <w:t xml:space="preserve">The guard reads the role from the user row loaded for each request, never from the session token, so a role removed in the database is refused on the very next request. An admin who has not finished onboarding is treated as a non-admin.</w:t>
+      </w:r>
+    </w:p>
+    <w:p>
+      <w:pPr>
+        <w:pStyle w:val="ListBullet"/>
+      </w:pPr>
+      <w:r>
+        <w:t xml:space="preserve">The session response carries </w:t>
+      </w:r>
+      <w:r>
+        <w:rPr>
+          <w:rFonts w:ascii="Consolas" w:hAnsi="Consolas"/>
+          <w:color w:val="A03030"/>
+          <w:sz w:val="19"/>
+        </w:rPr>
+        <w:t>isAdmin</w:t>
+      </w:r>
+      <w:r>
+        <w:t xml:space="preserve"> - the caller's own flag only, used to show the navigation entry. No other user's role leaves the server outside the admin area.</w:t>
+      </w:r>
+    </w:p>
+    <w:p>
+      <w:pPr>
+        <w:pStyle w:val="ListBullet"/>
+      </w:pPr>
+      <w:r>
         <w:t xml:space="preserve">A non-admin hitting an admin route receives </w:t>
       </w:r>
       <w:r>

</xml_diff>